<commit_message>
Add L2 automation and V2.3 test plan for Hot70 WA Bot.
Introduce run_full_test with PRD metrics, L2 gates, fail classification, run archiving, and LOCAL handoff docs; gitignore excludes test run outputs.

Co-authored-by: Cursor <cursoragent@cursor.com>
</commit_message>
<xml_diff>
--- a/projects/hot70-wa-bot/prd/Hot70_WhatsApp_Bot_Test_Plan.docx
+++ b/projects/hot70-wa-bot/prd/Hot70_WhatsApp_Bot_Test_Plan.docx
@@ -37,7 +37,7 @@
           <w:i w:val="0"/>
           <w:sz w:val="20"/>
         </w:rPr>
-        <w:t xml:space="preserve">：V2.0 | </w:t>
+        <w:t xml:space="preserve">：V2.1 | </w:t>
       </w:r>
       <w:r>
         <w:rPr>
@@ -55,7 +55,7 @@
           <w:i w:val="0"/>
           <w:sz w:val="20"/>
         </w:rPr>
-        <w:t>：2026-06-26</w:t>
+        <w:t>：2026-06-30</w:t>
       </w:r>
     </w:p>
     <w:p>
@@ -129,6 +129,47 @@
           <w:sz w:val="20"/>
         </w:rPr>
         <w:t>docs/ai-activity-platform/03-reusable-test-scheme-v1.md</w:t>
+      </w:r>
+    </w:p>
+    <w:p>
+      <w:pPr>
+        <w:ind w:left="432"/>
+      </w:pPr>
+      <w:r>
+        <w:rPr>
+          <w:rFonts w:ascii="Microsoft YaHei" w:hAnsi="Microsoft YaHei" w:eastAsia="Microsoft YaHei"/>
+          <w:b/>
+          <w:i w:val="0"/>
+          <w:sz w:val="20"/>
+        </w:rPr>
+        <w:t>框架落地</w:t>
+      </w:r>
+      <w:r>
+        <w:rPr>
+          <w:rFonts w:ascii="Microsoft YaHei" w:hAnsi="Microsoft YaHei" w:eastAsia="Microsoft YaHei"/>
+          <w:b w:val="0"/>
+          <w:i w:val="0"/>
+          <w:sz w:val="20"/>
+        </w:rPr>
+        <w:t>：</w:t>
+      </w:r>
+      <w:r>
+        <w:rPr>
+          <w:rFonts w:ascii="Consolas" w:hAnsi="Consolas" w:eastAsia="Microsoft YaHei"/>
+          <w:b w:val="0"/>
+          <w:i w:val="0"/>
+          <w:sz w:val="20"/>
+        </w:rPr>
+        <w:t>agent-human-test/</w:t>
+      </w:r>
+      <w:r>
+        <w:rPr>
+          <w:rFonts w:ascii="Microsoft YaHei" w:hAnsi="Microsoft YaHei" w:eastAsia="Microsoft YaHei"/>
+          <w:b w:val="0"/>
+          <w:i w:val="0"/>
+          <w:sz w:val="20"/>
+        </w:rPr>
+        <w:t>（独立可复用，不依赖 ship-pipeline）</w:t>
       </w:r>
     </w:p>
     <w:p/>
@@ -610,7 +651,7 @@
           <w:i w:val="0"/>
           <w:sz w:val="26"/>
         </w:rPr>
-        <w:t>2.3 入手顺序</w:t>
+        <w:t>2.3 标准执行顺序（Agent 流水线）</w:t>
       </w:r>
     </w:p>
     <w:p>
@@ -622,17 +663,54 @@
           <w:rFonts w:ascii="Consolas" w:hAnsi="Consolas"/>
           <w:sz w:val="18"/>
         </w:rPr>
-        <w:t>① 裁决 §12 待确认项（尤其转人工方案）</w:t>
-        <w:br/>
-        <w:t>② §8 前置 Checklist 全绿</w:t>
-        <w:br/>
-        <w:t>③ 冒烟 5 条（消息进→回→转人工→人工回→日志）</w:t>
-        <w:br/>
-        <w:t>④ Agent L2 批量语料（意图/知识库/转人工）</w:t>
-        <w:br/>
-        <w:t>⑤ 人工 L3 真机 + 坐席抽检</w:t>
-        <w:br/>
-        <w:t>⑥ L4 指标统计 → Go/No-Go</w:t>
+        <w:t>SpecMiner → TestFactory → [FAQ Review] → RegressionRunner → 人工 L3 → ReportScribe</w:t>
+      </w:r>
+    </w:p>
+    <w:p>
+      <w:r>
+        <w:rPr>
+          <w:rFonts w:ascii="Microsoft YaHei" w:hAnsi="Microsoft YaHei" w:eastAsia="Microsoft YaHei"/>
+          <w:b w:val="0"/>
+          <w:i w:val="0"/>
+          <w:sz w:val="22"/>
+        </w:rPr>
+        <w:t xml:space="preserve">阻塞项（Q01/Q02）可与 SpecMiner </w:t>
+      </w:r>
+      <w:r>
+        <w:rPr>
+          <w:rFonts w:ascii="Microsoft YaHei" w:hAnsi="Microsoft YaHei" w:eastAsia="Microsoft YaHei"/>
+          <w:b/>
+          <w:i w:val="0"/>
+          <w:sz w:val="22"/>
+        </w:rPr>
+        <w:t>并行追</w:t>
+      </w:r>
+      <w:r>
+        <w:rPr>
+          <w:rFonts w:ascii="Microsoft YaHei" w:hAnsi="Microsoft YaHei" w:eastAsia="Microsoft YaHei"/>
+          <w:b w:val="0"/>
+          <w:i w:val="0"/>
+          <w:sz w:val="22"/>
+        </w:rPr>
+        <w:t xml:space="preserve">，但不替代读需求写用例。详见各项目 </w:t>
+      </w:r>
+      <w:r>
+        <w:rPr>
+          <w:rFonts w:ascii="Consolas" w:hAnsi="Consolas" w:eastAsia="Microsoft YaHei"/>
+          <w:b w:val="0"/>
+          <w:i w:val="0"/>
+          <w:sz w:val="22"/>
+        </w:rPr>
+        <w:t>WORKFLOW.md</w:t>
+      </w:r>
+      <w:r>
+        <w:rPr>
+          <w:rFonts w:ascii="Microsoft YaHei" w:hAnsi="Microsoft YaHei" w:eastAsia="Microsoft YaHei"/>
+          <w:b w:val="0"/>
+          <w:i w:val="0"/>
+          <w:sz w:val="22"/>
+        </w:rPr>
+        <w:t>。</w:t>
       </w:r>
     </w:p>
     <w:p>
@@ -646,7 +724,41 @@
           <w:i w:val="0"/>
           <w:sz w:val="26"/>
         </w:rPr>
-        <w:t>2.4 人机分工概览</w:t>
+        <w:t>2.4 入手顺序（Hot70，Q01/Q02 已确认后）</w:t>
+      </w:r>
+    </w:p>
+    <w:p>
+      <w:pPr>
+        <w:ind w:left="288"/>
+      </w:pPr>
+      <w:r>
+        <w:rPr>
+          <w:rFonts w:ascii="Consolas" w:hAnsi="Consolas"/>
+          <w:sz w:val="18"/>
+        </w:rPr>
+        <w:t>① SpecMiner + TestFactory（读 PRD 写规则/用例）  ← 已执行，见 data/corpus-*.csv</w:t>
+        <w:br/>
+        <w:t>② FAQ 到位 → TestFactory 增量补 faq_ref</w:t>
+        <w:br/>
+        <w:t>③ 环境 G1 → 人工冒烟 G2</w:t>
+        <w:br/>
+        <w:t>④ 有测试 API → RegressionRunner L2</w:t>
+        <w:br/>
+        <w:t>⑤ L4 验收</w:t>
+      </w:r>
+    </w:p>
+    <w:p>
+      <w:pPr>
+        <w:pStyle w:val="Heading3"/>
+      </w:pPr>
+      <w:r>
+        <w:rPr>
+          <w:rFonts w:ascii="Microsoft YaHei" w:hAnsi="Microsoft YaHei" w:eastAsia="Microsoft YaHei"/>
+          <w:b/>
+          <w:i w:val="0"/>
+          <w:sz w:val="26"/>
+        </w:rPr>
+        <w:t>2.5 人机分工概览</w:t>
       </w:r>
     </w:p>
     <w:tbl>
@@ -5131,7 +5243,7 @@
           <w:i w:val="0"/>
           <w:sz w:val="26"/>
         </w:rPr>
-        <w:t>4.4 Agent 产出目录</w:t>
+        <w:t>4.4 框架落地目录（`agent-human-test/`）</w:t>
       </w:r>
     </w:p>
     <w:p>
@@ -5143,35 +5255,45 @@
           <w:rFonts w:ascii="Consolas" w:hAnsi="Consolas"/>
           <w:sz w:val="18"/>
         </w:rPr>
-        <w:t>test-data/hot70-bot/</w:t>
+        <w:t>agent-human-test/</w:t>
         <w:br/>
-        <w:t>├── faq-export/           # FAQ 快照（绑版本）</w:t>
+        <w:t>├── FRAMEWORK.md              # 通用 L0-L4 / G0-G4</w:t>
         <w:br/>
-        <w:t>├── corpus-intent.csv     # 意图语料</w:t>
+        <w:t>├── agents/                   # spec-miner, test-factory, regression-runner, report-scribe</w:t>
         <w:br/>
-        <w:t>├── corpus-kb.csv         # 知识库语料</w:t>
+        <w:t>└── projects/hot70-wa-bot/    # 本项目实例</w:t>
         <w:br/>
-        <w:t>├── corpus-handoff.csv    # 转人工语料</w:t>
+        <w:t xml:space="preserve">    ├── blocking.md           # G0 阻塞项</w:t>
         <w:br/>
-        <w:t>├── corpus-adversarial.csv</w:t>
+        <w:t xml:space="preserve">    ├── checklist-env.md      # G1</w:t>
         <w:br/>
-        <w:t>└── README.md</w:t>
+        <w:t xml:space="preserve">    ├── checklist-smoke.md    # G2</w:t>
         <w:br/>
+        <w:t xml:space="preserve">    ├── data/corpus-*.csv     # TestFactory 产出</w:t>
         <w:br/>
-        <w:t>scripts/hot70-bot-api/    # L1 接口脚本</w:t>
+        <w:t xml:space="preserve">    ├── scripts/              # RegressionRunner</w:t>
         <w:br/>
-        <w:t>reports/                  # offline-eval, metrics, daily</w:t>
+        <w:t xml:space="preserve">    └── reports/              # 报告</w:t>
       </w:r>
     </w:p>
     <w:p>
       <w:r>
         <w:rPr>
           <w:rFonts w:ascii="Microsoft YaHei" w:hAnsi="Microsoft YaHei" w:eastAsia="Microsoft YaHei"/>
-          <w:b/>
+          <w:b w:val="0"/>
           <w:i w:val="0"/>
           <w:sz w:val="22"/>
         </w:rPr>
-        <w:t>语料核心字段</w:t>
+        <w:t xml:space="preserve">新项目：复制 </w:t>
+      </w:r>
+      <w:r>
+        <w:rPr>
+          <w:rFonts w:ascii="Consolas" w:hAnsi="Consolas" w:eastAsia="Microsoft YaHei"/>
+          <w:b w:val="0"/>
+          <w:i w:val="0"/>
+          <w:sz w:val="22"/>
+        </w:rPr>
+        <w:t>projects/_template/</w:t>
       </w:r>
       <w:r>
         <w:rPr>
@@ -5180,7 +5302,7 @@
           <w:i w:val="0"/>
           <w:sz w:val="22"/>
         </w:rPr>
-        <w:t>：</w:t>
+        <w:t xml:space="preserve"> 或参照 </w:t>
       </w:r>
       <w:r>
         <w:rPr>
@@ -5189,7 +5311,16 @@
           <w:i w:val="0"/>
           <w:sz w:val="22"/>
         </w:rPr>
-        <w:t>id, input, expected_intent/action, expected_facts, should_handoff, priority, faq_ref</w:t>
+        <w:t>hot70-wa-bot/</w:t>
+      </w:r>
+      <w:r>
+        <w:rPr>
+          <w:rFonts w:ascii="Microsoft YaHei" w:hAnsi="Microsoft YaHei" w:eastAsia="Microsoft YaHei"/>
+          <w:b w:val="0"/>
+          <w:i w:val="0"/>
+          <w:sz w:val="22"/>
+        </w:rPr>
+        <w:t xml:space="preserve"> 结构。</w:t>
       </w:r>
     </w:p>
     <w:p>
@@ -5203,280 +5334,7 @@
           <w:i w:val="0"/>
           <w:sz w:val="26"/>
         </w:rPr>
-        <w:t>4.5 ship-pipeline 适配说明</w:t>
-      </w:r>
-    </w:p>
-    <w:tbl>
-      <w:tblPr>
-        <w:tblStyle w:val="TableGrid"/>
-        <w:tblW w:type="auto" w:w="0"/>
-        <w:jc w:val="center"/>
-        <w:tblLook w:firstColumn="1" w:firstRow="1" w:lastColumn="0" w:lastRow="0" w:noHBand="0" w:noVBand="1" w:val="04A0"/>
-      </w:tblPr>
-      <w:tblGrid>
-        <w:gridCol w:w="3024"/>
-        <w:gridCol w:w="3024"/>
-        <w:gridCol w:w="3024"/>
-      </w:tblGrid>
-      <w:tr>
-        <w:tc>
-          <w:tcPr>
-            <w:tcW w:type="dxa" w:w="3024"/>
-            <w:shd w:fill="2E5090" w:val="clear"/>
-          </w:tcPr>
-          <w:p>
-            <w:r/>
-            <w:r>
-              <w:rPr>
-                <w:rFonts w:ascii="Microsoft YaHei" w:hAnsi="Microsoft YaHei" w:eastAsia="Microsoft YaHei"/>
-                <w:b/>
-                <w:i w:val="0"/>
-                <w:color w:val="FFFFFF"/>
-                <w:sz w:val="20"/>
-              </w:rPr>
-              <w:t>ship Agent</w:t>
-            </w:r>
-          </w:p>
-        </w:tc>
-        <w:tc>
-          <w:tcPr>
-            <w:tcW w:type="dxa" w:w="3024"/>
-            <w:shd w:fill="2E5090" w:val="clear"/>
-          </w:tcPr>
-          <w:p>
-            <w:r/>
-            <w:r>
-              <w:rPr>
-                <w:rFonts w:ascii="Microsoft YaHei" w:hAnsi="Microsoft YaHei" w:eastAsia="Microsoft YaHei"/>
-                <w:b/>
-                <w:i w:val="0"/>
-                <w:color w:val="FFFFFF"/>
-                <w:sz w:val="20"/>
-              </w:rPr>
-              <w:t>适用性</w:t>
-            </w:r>
-          </w:p>
-        </w:tc>
-        <w:tc>
-          <w:tcPr>
-            <w:tcW w:type="dxa" w:w="3024"/>
-            <w:shd w:fill="2E5090" w:val="clear"/>
-          </w:tcPr>
-          <w:p>
-            <w:r/>
-            <w:r>
-              <w:rPr>
-                <w:rFonts w:ascii="Microsoft YaHei" w:hAnsi="Microsoft YaHei" w:eastAsia="Microsoft YaHei"/>
-                <w:b/>
-                <w:i w:val="0"/>
-                <w:color w:val="FFFFFF"/>
-                <w:sz w:val="20"/>
-              </w:rPr>
-              <w:t>说明</w:t>
-            </w:r>
-          </w:p>
-        </w:tc>
-      </w:tr>
-      <w:tr>
-        <w:tc>
-          <w:tcPr>
-            <w:tcW w:type="dxa" w:w="3024"/>
-          </w:tcPr>
-          <w:p>
-            <w:r/>
-            <w:r>
-              <w:rPr>
-                <w:rFonts w:ascii="Microsoft YaHei" w:hAnsi="Microsoft YaHei" w:eastAsia="Microsoft YaHei"/>
-                <w:b w:val="0"/>
-                <w:i w:val="0"/>
-                <w:sz w:val="20"/>
-              </w:rPr>
-              <w:t>ship-spec</w:t>
-            </w:r>
-          </w:p>
-        </w:tc>
-        <w:tc>
-          <w:tcPr>
-            <w:tcW w:type="dxa" w:w="3024"/>
-          </w:tcPr>
-          <w:p>
-            <w:r/>
-            <w:r>
-              <w:rPr>
-                <w:rFonts w:ascii="Microsoft YaHei" w:hAnsi="Microsoft YaHei" w:eastAsia="Microsoft YaHei"/>
-                <w:b w:val="0"/>
-                <w:i w:val="0"/>
-                <w:sz w:val="20"/>
-              </w:rPr>
-              <w:t>可选</w:t>
-            </w:r>
-          </w:p>
-        </w:tc>
-        <w:tc>
-          <w:tcPr>
-            <w:tcW w:type="dxa" w:w="3024"/>
-          </w:tcPr>
-          <w:p>
-            <w:r/>
-            <w:r>
-              <w:rPr>
-                <w:rFonts w:ascii="Microsoft YaHei" w:hAnsi="Microsoft YaHei" w:eastAsia="Microsoft YaHei"/>
-                <w:b w:val="0"/>
-                <w:i w:val="0"/>
-                <w:sz w:val="20"/>
-              </w:rPr>
-              <w:t xml:space="preserve">为回调/转人工 API 产 </w:t>
-            </w:r>
-            <w:r>
-              <w:rPr>
-                <w:rFonts w:ascii="Consolas" w:hAnsi="Consolas" w:eastAsia="Microsoft YaHei"/>
-                <w:b w:val="0"/>
-                <w:i w:val="0"/>
-                <w:sz w:val="20"/>
-              </w:rPr>
-              <w:t>*.api.yaml</w:t>
-            </w:r>
-            <w:r>
-              <w:rPr>
-                <w:rFonts w:ascii="Microsoft YaHei" w:hAnsi="Microsoft YaHei" w:eastAsia="Microsoft YaHei"/>
-                <w:b w:val="0"/>
-                <w:i w:val="0"/>
-                <w:sz w:val="20"/>
-              </w:rPr>
-              <w:t xml:space="preserve"> oracle</w:t>
-            </w:r>
-          </w:p>
-        </w:tc>
-      </w:tr>
-      <w:tr>
-        <w:tc>
-          <w:tcPr>
-            <w:tcW w:type="dxa" w:w="3024"/>
-          </w:tcPr>
-          <w:p>
-            <w:r/>
-            <w:r>
-              <w:rPr>
-                <w:rFonts w:ascii="Microsoft YaHei" w:hAnsi="Microsoft YaHei" w:eastAsia="Microsoft YaHei"/>
-                <w:b w:val="0"/>
-                <w:i w:val="0"/>
-                <w:sz w:val="20"/>
-              </w:rPr>
-              <w:t>ship-verifier</w:t>
-            </w:r>
-          </w:p>
-        </w:tc>
-        <w:tc>
-          <w:tcPr>
-            <w:tcW w:type="dxa" w:w="3024"/>
-          </w:tcPr>
-          <w:p>
-            <w:r/>
-            <w:r>
-              <w:rPr>
-                <w:rFonts w:ascii="Microsoft YaHei" w:hAnsi="Microsoft YaHei" w:eastAsia="Microsoft YaHei"/>
-                <w:b w:val="0"/>
-                <w:i w:val="0"/>
-                <w:sz w:val="20"/>
-              </w:rPr>
-              <w:t>部分</w:t>
-            </w:r>
-          </w:p>
-        </w:tc>
-        <w:tc>
-          <w:tcPr>
-            <w:tcW w:type="dxa" w:w="3024"/>
-          </w:tcPr>
-          <w:p>
-            <w:r/>
-            <w:r>
-              <w:rPr>
-                <w:rFonts w:ascii="Microsoft YaHei" w:hAnsi="Microsoft YaHei" w:eastAsia="Microsoft YaHei"/>
-                <w:b w:val="0"/>
-                <w:i w:val="0"/>
-                <w:sz w:val="20"/>
-              </w:rPr>
-              <w:t>T0/T1 API + 红队；</w:t>
-            </w:r>
-            <w:r>
-              <w:rPr>
-                <w:rFonts w:ascii="Microsoft YaHei" w:hAnsi="Microsoft YaHei" w:eastAsia="Microsoft YaHei"/>
-                <w:b/>
-                <w:i w:val="0"/>
-                <w:sz w:val="20"/>
-              </w:rPr>
-              <w:t>不含真机 WA E2E</w:t>
-            </w:r>
-          </w:p>
-        </w:tc>
-      </w:tr>
-      <w:tr>
-        <w:tc>
-          <w:tcPr>
-            <w:tcW w:type="dxa" w:w="3024"/>
-          </w:tcPr>
-          <w:p>
-            <w:r/>
-            <w:r>
-              <w:rPr>
-                <w:rFonts w:ascii="Microsoft YaHei" w:hAnsi="Microsoft YaHei" w:eastAsia="Microsoft YaHei"/>
-                <w:b w:val="0"/>
-                <w:i w:val="0"/>
-                <w:sz w:val="20"/>
-              </w:rPr>
-              <w:t>ship-builder / product / orchestrator</w:t>
-            </w:r>
-          </w:p>
-        </w:tc>
-        <w:tc>
-          <w:tcPr>
-            <w:tcW w:type="dxa" w:w="3024"/>
-          </w:tcPr>
-          <w:p>
-            <w:r/>
-            <w:r>
-              <w:rPr>
-                <w:rFonts w:ascii="Microsoft YaHei" w:hAnsi="Microsoft YaHei" w:eastAsia="Microsoft YaHei"/>
-                <w:b w:val="0"/>
-                <w:i w:val="0"/>
-                <w:sz w:val="20"/>
-              </w:rPr>
-              <w:t>不用</w:t>
-            </w:r>
-          </w:p>
-        </w:tc>
-        <w:tc>
-          <w:tcPr>
-            <w:tcW w:type="dxa" w:w="3024"/>
-          </w:tcPr>
-          <w:p>
-            <w:r/>
-            <w:r>
-              <w:rPr>
-                <w:rFonts w:ascii="Microsoft YaHei" w:hAnsi="Microsoft YaHei" w:eastAsia="Microsoft YaHei"/>
-                <w:b w:val="0"/>
-                <w:i w:val="0"/>
-                <w:sz w:val="20"/>
-              </w:rPr>
-              <w:t>开发/PRD 侧</w:t>
-            </w:r>
-          </w:p>
-        </w:tc>
-      </w:tr>
-    </w:tbl>
-    <w:p/>
-    <w:p>
-      <w:pPr>
-        <w:pStyle w:val="Heading3"/>
-      </w:pPr>
-      <w:r>
-        <w:rPr>
-          <w:rFonts w:ascii="Microsoft YaHei" w:hAnsi="Microsoft YaHei" w:eastAsia="Microsoft YaHei"/>
-          <w:b/>
-          <w:i w:val="0"/>
-          <w:sz w:val="26"/>
-        </w:rPr>
-        <w:t>4.6 Agent 首批任务（Phase 0 启动）</w:t>
+        <w:t>4.5 Agent 首批任务（Phase 0 启动）</w:t>
       </w:r>
     </w:p>
     <w:p>
@@ -6546,25 +6404,7 @@
                 <w:i w:val="0"/>
                 <w:sz w:val="20"/>
               </w:rPr>
-              <w:t xml:space="preserve">技能组 </w:t>
-            </w:r>
-            <w:r>
-              <w:rPr>
-                <w:rFonts w:ascii="Microsoft YaHei" w:hAnsi="Microsoft YaHei" w:eastAsia="Microsoft YaHei"/>
-                <w:b/>
-                <w:i w:val="0"/>
-                <w:sz w:val="20"/>
-              </w:rPr>
-              <w:t>或</w:t>
-            </w:r>
-            <w:r>
-              <w:rPr>
-                <w:rFonts w:ascii="Microsoft YaHei" w:hAnsi="Microsoft YaHei" w:eastAsia="Microsoft YaHei"/>
-                <w:b w:val="0"/>
-                <w:i w:val="0"/>
-                <w:sz w:val="20"/>
-              </w:rPr>
-              <w:t xml:space="preserve"> 坐席 A~E</w:t>
+              <w:t>Hot70 专属技能组（传 groupid，已确认）</w:t>
             </w:r>
           </w:p>
         </w:tc>
@@ -6643,7 +6483,7 @@
           <w:i w:val="0"/>
           <w:sz w:val="22"/>
         </w:rPr>
-        <w:t>[ ] Q01（技能组/轮询）、Q02（转人工后机器人行为）已裁决</w:t>
+        <w:t>[ ] Q01 ✅ 技能组 ID；Q02 ✅ 转人工后机器人不自动回复</w:t>
       </w:r>
     </w:p>
     <w:p>
@@ -6863,7 +6703,7 @@
                 <w:i w:val="0"/>
                 <w:sz w:val="20"/>
               </w:rPr>
-              <w:t>10s 内机器人回复；日志有记录</w:t>
+              <w:t>10s 内机器人回复；messages 有 inbound</w:t>
             </w:r>
           </w:p>
         </w:tc>
@@ -6916,7 +6756,7 @@
                 <w:i w:val="0"/>
                 <w:sz w:val="20"/>
               </w:rPr>
-              <w:t>含价格；knowledge_hit=true</w:t>
+              <w:t>含价格；RAG/tools 日志可观测</w:t>
             </w:r>
           </w:p>
         </w:tc>
@@ -6935,7 +6775,7 @@
                 <w:i w:val="0"/>
                 <w:sz w:val="20"/>
               </w:rPr>
-              <w:t>TC-SMOKE-003</w:t>
+              <w:t>TC-SMOKE-003-LOCAL</w:t>
             </w:r>
           </w:p>
         </w:tc>
@@ -6965,11 +6805,29 @@
             <w:r>
               <w:rPr>
                 <w:rFonts w:ascii="Microsoft YaHei" w:hAnsi="Microsoft YaHei" w:eastAsia="Microsoft YaHei"/>
-                <w:b w:val="0"/>
-                <w:i w:val="0"/>
-                <w:sz w:val="20"/>
-              </w:rPr>
-              <w:t>handoff=true；工作台有会话；机器人暂停</w:t>
+                <w:b/>
+                <w:i w:val="0"/>
+                <w:sz w:val="20"/>
+              </w:rPr>
+              <w:t>Web 本地</w:t>
+            </w:r>
+            <w:r>
+              <w:rPr>
+                <w:rFonts w:ascii="Microsoft YaHei" w:hAnsi="Microsoft YaHei" w:eastAsia="Microsoft YaHei"/>
+                <w:b w:val="0"/>
+                <w:i w:val="0"/>
+                <w:sz w:val="20"/>
+              </w:rPr>
+              <w:t>分配；</w:t>
+            </w:r>
+            <w:r>
+              <w:rPr>
+                <w:rFonts w:ascii="Consolas" w:hAnsi="Consolas" w:eastAsia="Microsoft YaHei"/>
+                <w:b w:val="0"/>
+                <w:i w:val="0"/>
+                <w:sz w:val="20"/>
+              </w:rPr>
+              <w:t>isActiveAgent=0</w:t>
             </w:r>
           </w:p>
         </w:tc>
@@ -6988,7 +6846,7 @@
                 <w:i w:val="0"/>
                 <w:sz w:val="20"/>
               </w:rPr>
-              <w:t>TC-SMOKE-004</w:t>
+              <w:t>TC-SMOKE-003-EXT</w:t>
             </w:r>
           </w:p>
         </w:tc>
@@ -7005,7 +6863,7 @@
                 <w:i w:val="0"/>
                 <w:sz w:val="20"/>
               </w:rPr>
-              <w:t>坐席回复</w:t>
+              <w:t>工作台外部转人工</w:t>
             </w:r>
           </w:p>
         </w:tc>
@@ -7018,11 +6876,20 @@
             <w:r>
               <w:rPr>
                 <w:rFonts w:ascii="Microsoft YaHei" w:hAnsi="Microsoft YaHei" w:eastAsia="Microsoft YaHei"/>
-                <w:b w:val="0"/>
-                <w:i w:val="0"/>
-                <w:sz w:val="20"/>
-              </w:rPr>
-              <w:t>用户 WA 收到</w:t>
+                <w:b/>
+                <w:i w:val="0"/>
+                <w:sz w:val="20"/>
+              </w:rPr>
+              <w:t>智齿</w:t>
+            </w:r>
+            <w:r>
+              <w:rPr>
+                <w:rFonts w:ascii="Microsoft YaHei" w:hAnsi="Microsoft YaHei" w:eastAsia="Microsoft YaHei"/>
+                <w:b w:val="0"/>
+                <w:i w:val="0"/>
+                <w:sz w:val="20"/>
+              </w:rPr>
+              <w:t>工作台有会话；含 groupid</w:t>
             </w:r>
           </w:p>
         </w:tc>
@@ -7041,6 +6908,112 @@
                 <w:i w:val="0"/>
                 <w:sz w:val="20"/>
               </w:rPr>
+              <w:t>TC-SMOKE-003b</w:t>
+            </w:r>
+          </w:p>
+        </w:tc>
+        <w:tc>
+          <w:tcPr>
+            <w:tcW w:type="dxa" w:w="3024"/>
+          </w:tcPr>
+          <w:p>
+            <w:r/>
+            <w:r>
+              <w:rPr>
+                <w:rFonts w:ascii="Microsoft YaHei" w:hAnsi="Microsoft YaHei" w:eastAsia="Microsoft YaHei"/>
+                <w:b w:val="0"/>
+                <w:i w:val="0"/>
+                <w:sz w:val="20"/>
+              </w:rPr>
+              <w:t>转人工后再发 2 条</w:t>
+            </w:r>
+          </w:p>
+        </w:tc>
+        <w:tc>
+          <w:tcPr>
+            <w:tcW w:type="dxa" w:w="3024"/>
+          </w:tcPr>
+          <w:p>
+            <w:r/>
+            <w:r>
+              <w:rPr>
+                <w:rFonts w:ascii="Microsoft YaHei" w:hAnsi="Microsoft YaHei" w:eastAsia="Microsoft YaHei"/>
+                <w:b w:val="0"/>
+                <w:i w:val="0"/>
+                <w:sz w:val="20"/>
+              </w:rPr>
+              <w:t>无机器人自动回复（Q02）</w:t>
+            </w:r>
+          </w:p>
+        </w:tc>
+      </w:tr>
+      <w:tr>
+        <w:tc>
+          <w:tcPr>
+            <w:tcW w:type="dxa" w:w="3024"/>
+          </w:tcPr>
+          <w:p>
+            <w:r/>
+            <w:r>
+              <w:rPr>
+                <w:rFonts w:ascii="Microsoft YaHei" w:hAnsi="Microsoft YaHei" w:eastAsia="Microsoft YaHei"/>
+                <w:b w:val="0"/>
+                <w:i w:val="0"/>
+                <w:sz w:val="20"/>
+              </w:rPr>
+              <w:t>TC-SMOKE-004</w:t>
+            </w:r>
+          </w:p>
+        </w:tc>
+        <w:tc>
+          <w:tcPr>
+            <w:tcW w:type="dxa" w:w="3024"/>
+          </w:tcPr>
+          <w:p>
+            <w:r/>
+            <w:r>
+              <w:rPr>
+                <w:rFonts w:ascii="Microsoft YaHei" w:hAnsi="Microsoft YaHei" w:eastAsia="Microsoft YaHei"/>
+                <w:b w:val="0"/>
+                <w:i w:val="0"/>
+                <w:sz w:val="20"/>
+              </w:rPr>
+              <w:t>坐席回复</w:t>
+            </w:r>
+          </w:p>
+        </w:tc>
+        <w:tc>
+          <w:tcPr>
+            <w:tcW w:type="dxa" w:w="3024"/>
+          </w:tcPr>
+          <w:p>
+            <w:r/>
+            <w:r>
+              <w:rPr>
+                <w:rFonts w:ascii="Microsoft YaHei" w:hAnsi="Microsoft YaHei" w:eastAsia="Microsoft YaHei"/>
+                <w:b w:val="0"/>
+                <w:i w:val="0"/>
+                <w:sz w:val="20"/>
+              </w:rPr>
+              <w:t>用户 WA 收到</w:t>
+            </w:r>
+          </w:p>
+        </w:tc>
+      </w:tr>
+      <w:tr>
+        <w:tc>
+          <w:tcPr>
+            <w:tcW w:type="dxa" w:w="3024"/>
+          </w:tcPr>
+          <w:p>
+            <w:r/>
+            <w:r>
+              <w:rPr>
+                <w:rFonts w:ascii="Microsoft YaHei" w:hAnsi="Microsoft YaHei" w:eastAsia="Microsoft YaHei"/>
+                <w:b w:val="0"/>
+                <w:i w:val="0"/>
+                <w:sz w:val="20"/>
+              </w:rPr>
               <w:t>TC-SMOKE-005</w:t>
             </w:r>
           </w:p>
@@ -7058,7 +7031,7 @@
                 <w:i w:val="0"/>
                 <w:sz w:val="20"/>
               </w:rPr>
-              <w:t>查 session_id 日志</w:t>
+              <w:t>查 agent/session + messages</w:t>
             </w:r>
           </w:p>
         </w:tc>
@@ -7075,7 +7048,16 @@
                 <w:i w:val="0"/>
                 <w:sz w:val="20"/>
               </w:rPr>
-              <w:t>全链路字段齐全</w:t>
+              <w:t xml:space="preserve">见 </w:t>
+            </w:r>
+            <w:r>
+              <w:rPr>
+                <w:rFonts w:ascii="Consolas" w:hAnsi="Consolas" w:eastAsia="Microsoft YaHei"/>
+                <w:b w:val="0"/>
+                <w:i w:val="0"/>
+                <w:sz w:val="20"/>
+              </w:rPr>
+              <w:t>spec/log-field-mapping.md</w:t>
             </w:r>
           </w:p>
         </w:tc>
@@ -7424,11 +7406,20 @@
             <w:r>
               <w:rPr>
                 <w:rFonts w:ascii="Microsoft YaHei" w:hAnsi="Microsoft YaHei" w:eastAsia="Microsoft YaHei"/>
-                <w:b w:val="0"/>
-                <w:i w:val="0"/>
-                <w:sz w:val="20"/>
-              </w:rPr>
-              <w:t>8 类触发 + 6 字段校验 + 暂停</w:t>
+                <w:b/>
+                <w:i w:val="0"/>
+                <w:sz w:val="20"/>
+              </w:rPr>
+              <w:t>双路径</w:t>
+            </w:r>
+            <w:r>
+              <w:rPr>
+                <w:rFonts w:ascii="Microsoft YaHei" w:hAnsi="Microsoft YaHei" w:eastAsia="Microsoft YaHei"/>
+                <w:b w:val="0"/>
+                <w:i w:val="0"/>
+                <w:sz w:val="20"/>
+              </w:rPr>
+              <w:t>：LOCAL（AI 自动）+ EXT（智齿 external-handoff）；字段校验仅 EXT</w:t>
             </w:r>
           </w:p>
         </w:tc>
@@ -7498,7 +7489,7 @@
                 <w:i w:val="0"/>
                 <w:sz w:val="20"/>
               </w:rPr>
-              <w:t xml:space="preserve">技能组 </w:t>
+              <w:t xml:space="preserve">传 </w:t>
             </w:r>
             <w:r>
               <w:rPr>
@@ -7507,16 +7498,25 @@
                 <w:i w:val="0"/>
                 <w:sz w:val="20"/>
               </w:rPr>
-              <w:t>或</w:t>
-            </w:r>
-            <w:r>
-              <w:rPr>
-                <w:rFonts w:ascii="Microsoft YaHei" w:hAnsi="Microsoft YaHei" w:eastAsia="Microsoft YaHei"/>
-                <w:b w:val="0"/>
-                <w:i w:val="0"/>
-                <w:sz w:val="20"/>
-              </w:rPr>
-              <w:t xml:space="preserve"> A→E 轮询 + 同用户回原坐席</w:t>
+              <w:t>groupid</w:t>
+            </w:r>
+            <w:r>
+              <w:rPr>
+                <w:rFonts w:ascii="Microsoft YaHei" w:hAnsi="Microsoft YaHei" w:eastAsia="Microsoft YaHei"/>
+                <w:b w:val="0"/>
+                <w:i w:val="0"/>
+                <w:sz w:val="20"/>
+              </w:rPr>
+              <w:t xml:space="preserve"> → 智齿分配；</w:t>
+            </w:r>
+            <w:r>
+              <w:rPr>
+                <w:rFonts w:ascii="Microsoft YaHei" w:hAnsi="Microsoft YaHei" w:eastAsia="Microsoft YaHei"/>
+                <w:b/>
+                <w:i w:val="0"/>
+                <w:sz w:val="20"/>
+              </w:rPr>
+              <w:t>仅 external-handoff 后</w:t>
             </w:r>
           </w:p>
         </w:tc>
@@ -7533,7 +7533,7 @@
                 <w:i w:val="0"/>
                 <w:sz w:val="20"/>
               </w:rPr>
-              <w:t>方案相关</w:t>
+              <w:t>3 条</w:t>
             </w:r>
           </w:p>
         </w:tc>
@@ -7550,7 +7550,7 @@
                 <w:i w:val="0"/>
                 <w:sz w:val="20"/>
               </w:rPr>
-              <w:t>L3</w:t>
+              <w:t>L1/L3</w:t>
             </w:r>
           </w:p>
         </w:tc>
@@ -7656,7 +7656,7 @@
                 <w:i w:val="0"/>
                 <w:sz w:val="20"/>
               </w:rPr>
-              <w:t>§7.5 全字段 + 未命中可汇总</w:t>
+              <w:t>agent/session + audit-logs + tools/logs（见映射表）</w:t>
             </w:r>
           </w:p>
         </w:tc>
@@ -7726,7 +7726,25 @@
                 <w:i w:val="0"/>
                 <w:sz w:val="20"/>
               </w:rPr>
-              <w:t>5 类标签写入/不强行打标/更新</w:t>
+              <w:t xml:space="preserve">5 类智齿标签 — </w:t>
+            </w:r>
+            <w:r>
+              <w:rPr>
+                <w:rFonts w:ascii="Microsoft YaHei" w:hAnsi="Microsoft YaHei" w:eastAsia="Microsoft YaHei"/>
+                <w:b/>
+                <w:i w:val="0"/>
+                <w:sz w:val="20"/>
+              </w:rPr>
+              <w:t>Blocked</w:t>
+            </w:r>
+            <w:r>
+              <w:rPr>
+                <w:rFonts w:ascii="Microsoft YaHei" w:hAnsi="Microsoft YaHei" w:eastAsia="Microsoft YaHei"/>
+                <w:b w:val="0"/>
+                <w:i w:val="0"/>
+                <w:sz w:val="20"/>
+              </w:rPr>
+              <w:t>（后端未实现）</w:t>
             </w:r>
           </w:p>
         </w:tc>
@@ -7760,7 +7778,7 @@
                 <w:i w:val="0"/>
                 <w:sz w:val="20"/>
               </w:rPr>
-              <w:t>L2</w:t>
+              <w:t>—</w:t>
             </w:r>
           </w:p>
         </w:tc>
@@ -8217,11 +8235,20 @@
             <w:r>
               <w:rPr>
                 <w:rFonts w:ascii="Microsoft YaHei" w:hAnsi="Microsoft YaHei" w:eastAsia="Microsoft YaHei"/>
-                <w:b w:val="0"/>
-                <w:i w:val="0"/>
-                <w:sz w:val="20"/>
-              </w:rPr>
-              <w:t>Agent 对比</w:t>
+                <w:b/>
+                <w:i w:val="0"/>
+                <w:sz w:val="20"/>
+              </w:rPr>
+              <w:t>task_type 路由+动作</w:t>
+            </w:r>
+            <w:r>
+              <w:rPr>
+                <w:rFonts w:ascii="Microsoft YaHei" w:hAnsi="Microsoft YaHei" w:eastAsia="Microsoft YaHei"/>
+                <w:b w:val="0"/>
+                <w:i w:val="0"/>
+                <w:sz w:val="20"/>
+              </w:rPr>
+              <w:t>（见 intent-task-mapping）</w:t>
             </w:r>
           </w:p>
         </w:tc>
@@ -9377,15 +9404,16 @@
         <w:tblLook w:firstColumn="1" w:firstRow="1" w:lastColumn="0" w:lastRow="0" w:noHBand="0" w:noVBand="1" w:val="04A0"/>
       </w:tblPr>
       <w:tblGrid>
-        <w:gridCol w:w="2268"/>
-        <w:gridCol w:w="2268"/>
-        <w:gridCol w:w="2268"/>
-        <w:gridCol w:w="2268"/>
+        <w:gridCol w:w="1814"/>
+        <w:gridCol w:w="1814"/>
+        <w:gridCol w:w="1814"/>
+        <w:gridCol w:w="1814"/>
+        <w:gridCol w:w="1814"/>
       </w:tblGrid>
       <w:tr>
         <w:tc>
           <w:tcPr>
-            <w:tcW w:type="dxa" w:w="2268"/>
+            <w:tcW w:type="dxa" w:w="1814"/>
             <w:shd w:fill="2E5090" w:val="clear"/>
           </w:tcPr>
           <w:p>
@@ -9404,7 +9432,7 @@
         </w:tc>
         <w:tc>
           <w:tcPr>
-            <w:tcW w:type="dxa" w:w="2268"/>
+            <w:tcW w:type="dxa" w:w="1814"/>
             <w:shd w:fill="2E5090" w:val="clear"/>
           </w:tcPr>
           <w:p>
@@ -9423,7 +9451,7 @@
         </w:tc>
         <w:tc>
           <w:tcPr>
-            <w:tcW w:type="dxa" w:w="2268"/>
+            <w:tcW w:type="dxa" w:w="1814"/>
             <w:shd w:fill="2E5090" w:val="clear"/>
           </w:tcPr>
           <w:p>
@@ -9442,7 +9470,7 @@
         </w:tc>
         <w:tc>
           <w:tcPr>
-            <w:tcW w:type="dxa" w:w="2268"/>
+            <w:tcW w:type="dxa" w:w="1814"/>
             <w:shd w:fill="2E5090" w:val="clear"/>
           </w:tcPr>
           <w:p>
@@ -9456,6 +9484,25 @@
                 <w:sz w:val="20"/>
               </w:rPr>
               <w:t>裁决人</w:t>
+            </w:r>
+          </w:p>
+        </w:tc>
+        <w:tc>
+          <w:tcPr>
+            <w:tcW w:type="dxa" w:w="1814"/>
+            <w:shd w:fill="2E5090" w:val="clear"/>
+          </w:tcPr>
+          <w:p>
+            <w:r/>
+            <w:r>
+              <w:rPr>
+                <w:rFonts w:ascii="Microsoft YaHei" w:hAnsi="Microsoft YaHei" w:eastAsia="Microsoft YaHei"/>
+                <w:b/>
+                <w:i w:val="0"/>
+                <w:color w:val="FFFFFF"/>
+                <w:sz w:val="20"/>
+              </w:rPr>
+              <w:t>状态</w:t>
             </w:r>
           </w:p>
         </w:tc>
@@ -9463,7 +9510,7 @@
       <w:tr>
         <w:tc>
           <w:tcPr>
-            <w:tcW w:type="dxa" w:w="2268"/>
+            <w:tcW w:type="dxa" w:w="1814"/>
           </w:tcPr>
           <w:p>
             <w:r/>
@@ -9480,7 +9527,7 @@
         </w:tc>
         <w:tc>
           <w:tcPr>
-            <w:tcW w:type="dxa" w:w="2268"/>
+            <w:tcW w:type="dxa" w:w="1814"/>
           </w:tcPr>
           <w:p>
             <w:r/>
@@ -9497,7 +9544,7 @@
         </w:tc>
         <w:tc>
           <w:tcPr>
-            <w:tcW w:type="dxa" w:w="2268"/>
+            <w:tcW w:type="dxa" w:w="1814"/>
           </w:tcPr>
           <w:p>
             <w:r/>
@@ -9514,7 +9561,7 @@
         </w:tc>
         <w:tc>
           <w:tcPr>
-            <w:tcW w:type="dxa" w:w="2268"/>
+            <w:tcW w:type="dxa" w:w="1814"/>
           </w:tcPr>
           <w:p>
             <w:r/>
@@ -9526,6 +9573,32 @@
                 <w:sz w:val="20"/>
               </w:rPr>
               <w:t>产品 + 智齿</w:t>
+            </w:r>
+          </w:p>
+        </w:tc>
+        <w:tc>
+          <w:tcPr>
+            <w:tcW w:type="dxa" w:w="1814"/>
+          </w:tcPr>
+          <w:p>
+            <w:r/>
+            <w:r>
+              <w:rPr>
+                <w:rFonts w:ascii="Microsoft YaHei" w:hAnsi="Microsoft YaHei" w:eastAsia="Microsoft YaHei"/>
+                <w:b w:val="0"/>
+                <w:i w:val="0"/>
+                <w:sz w:val="20"/>
+              </w:rPr>
+              <w:t xml:space="preserve">✅ </w:t>
+            </w:r>
+            <w:r>
+              <w:rPr>
+                <w:rFonts w:ascii="Microsoft YaHei" w:hAnsi="Microsoft YaHei" w:eastAsia="Microsoft YaHei"/>
+                <w:b/>
+                <w:i w:val="0"/>
+                <w:sz w:val="20"/>
+              </w:rPr>
+              <w:t>技能组 ID</w:t>
             </w:r>
           </w:p>
         </w:tc>
@@ -9533,7 +9606,7 @@
       <w:tr>
         <w:tc>
           <w:tcPr>
-            <w:tcW w:type="dxa" w:w="2268"/>
+            <w:tcW w:type="dxa" w:w="1814"/>
           </w:tcPr>
           <w:p>
             <w:r/>
@@ -9550,7 +9623,7 @@
         </w:tc>
         <w:tc>
           <w:tcPr>
-            <w:tcW w:type="dxa" w:w="2268"/>
+            <w:tcW w:type="dxa" w:w="1814"/>
           </w:tcPr>
           <w:p>
             <w:r/>
@@ -9567,7 +9640,7 @@
         </w:tc>
         <w:tc>
           <w:tcPr>
-            <w:tcW w:type="dxa" w:w="2268"/>
+            <w:tcW w:type="dxa" w:w="1814"/>
           </w:tcPr>
           <w:p>
             <w:r/>
@@ -9584,7 +9657,7 @@
         </w:tc>
         <w:tc>
           <w:tcPr>
-            <w:tcW w:type="dxa" w:w="2268"/>
+            <w:tcW w:type="dxa" w:w="1814"/>
           </w:tcPr>
           <w:p>
             <w:r/>
@@ -9596,6 +9669,32 @@
                 <w:sz w:val="20"/>
               </w:rPr>
               <w:t>产品</w:t>
+            </w:r>
+          </w:p>
+        </w:tc>
+        <w:tc>
+          <w:tcPr>
+            <w:tcW w:type="dxa" w:w="1814"/>
+          </w:tcPr>
+          <w:p>
+            <w:r/>
+            <w:r>
+              <w:rPr>
+                <w:rFonts w:ascii="Microsoft YaHei" w:hAnsi="Microsoft YaHei" w:eastAsia="Microsoft YaHei"/>
+                <w:b w:val="0"/>
+                <w:i w:val="0"/>
+                <w:sz w:val="20"/>
+              </w:rPr>
+              <w:t xml:space="preserve">✅ </w:t>
+            </w:r>
+            <w:r>
+              <w:rPr>
+                <w:rFonts w:ascii="Microsoft YaHei" w:hAnsi="Microsoft YaHei" w:eastAsia="Microsoft YaHei"/>
+                <w:b/>
+                <w:i w:val="0"/>
+                <w:sz w:val="20"/>
+              </w:rPr>
+              <w:t>不自动回复</w:t>
             </w:r>
           </w:p>
         </w:tc>
@@ -9603,7 +9702,7 @@
       <w:tr>
         <w:tc>
           <w:tcPr>
-            <w:tcW w:type="dxa" w:w="2268"/>
+            <w:tcW w:type="dxa" w:w="1814"/>
           </w:tcPr>
           <w:p>
             <w:r/>
@@ -9620,24 +9719,24 @@
         </w:tc>
         <w:tc>
           <w:tcPr>
-            <w:tcW w:type="dxa" w:w="2268"/>
-          </w:tcPr>
-          <w:p>
-            <w:r/>
-            <w:r>
-              <w:rPr>
-                <w:rFonts w:ascii="Microsoft YaHei" w:hAnsi="Microsoft YaHei" w:eastAsia="Microsoft YaHei"/>
-                <w:b w:val="0"/>
-                <w:i w:val="0"/>
-                <w:sz w:val="20"/>
-              </w:rPr>
-              <w:t>同一会话周期 / 回原坐席超时？</w:t>
-            </w:r>
-          </w:p>
-        </w:tc>
-        <w:tc>
-          <w:tcPr>
-            <w:tcW w:type="dxa" w:w="2268"/>
+            <w:tcW w:type="dxa" w:w="1814"/>
+          </w:tcPr>
+          <w:p>
+            <w:r/>
+            <w:r>
+              <w:rPr>
+                <w:rFonts w:ascii="Microsoft YaHei" w:hAnsi="Microsoft YaHei" w:eastAsia="Microsoft YaHei"/>
+                <w:b w:val="0"/>
+                <w:i w:val="0"/>
+                <w:sz w:val="20"/>
+              </w:rPr>
+              <w:t>同一会话 / 回原坐席（技能组下由智齿负责）</w:t>
+            </w:r>
+          </w:p>
+        </w:tc>
+        <w:tc>
+          <w:tcPr>
+            <w:tcW w:type="dxa" w:w="1814"/>
           </w:tcPr>
           <w:p>
             <w:r/>
@@ -9654,18 +9753,35 @@
         </w:tc>
         <w:tc>
           <w:tcPr>
-            <w:tcW w:type="dxa" w:w="2268"/>
-          </w:tcPr>
-          <w:p>
-            <w:r/>
-            <w:r>
-              <w:rPr>
-                <w:rFonts w:ascii="Microsoft YaHei" w:hAnsi="Microsoft YaHei" w:eastAsia="Microsoft YaHei"/>
-                <w:b w:val="0"/>
-                <w:i w:val="0"/>
-                <w:sz w:val="20"/>
-              </w:rPr>
-              <w:t>产品 + 开发</w:t>
+            <w:tcW w:type="dxa" w:w="1814"/>
+          </w:tcPr>
+          <w:p>
+            <w:r/>
+            <w:r>
+              <w:rPr>
+                <w:rFonts w:ascii="Microsoft YaHei" w:hAnsi="Microsoft YaHei" w:eastAsia="Microsoft YaHei"/>
+                <w:b w:val="0"/>
+                <w:i w:val="0"/>
+                <w:sz w:val="20"/>
+              </w:rPr>
+              <w:t>产品 + 智齿</w:t>
+            </w:r>
+          </w:p>
+        </w:tc>
+        <w:tc>
+          <w:tcPr>
+            <w:tcW w:type="dxa" w:w="1814"/>
+          </w:tcPr>
+          <w:p>
+            <w:r/>
+            <w:r>
+              <w:rPr>
+                <w:rFonts w:ascii="Microsoft YaHei" w:hAnsi="Microsoft YaHei" w:eastAsia="Microsoft YaHei"/>
+                <w:b w:val="0"/>
+                <w:i w:val="0"/>
+                <w:sz w:val="20"/>
+              </w:rPr>
+              <w:t>⬜ 首版不测传音轮询</w:t>
             </w:r>
           </w:p>
         </w:tc>
@@ -9673,7 +9789,7 @@
       <w:tr>
         <w:tc>
           <w:tcPr>
-            <w:tcW w:type="dxa" w:w="2268"/>
+            <w:tcW w:type="dxa" w:w="1814"/>
           </w:tcPr>
           <w:p>
             <w:r/>
@@ -9690,7 +9806,7 @@
         </w:tc>
         <w:tc>
           <w:tcPr>
-            <w:tcW w:type="dxa" w:w="2268"/>
+            <w:tcW w:type="dxa" w:w="1814"/>
           </w:tcPr>
           <w:p>
             <w:r/>
@@ -9707,24 +9823,24 @@
         </w:tc>
         <w:tc>
           <w:tcPr>
-            <w:tcW w:type="dxa" w:w="2268"/>
-          </w:tcPr>
-          <w:p>
-            <w:r/>
-            <w:r>
-              <w:rPr>
-                <w:rFonts w:ascii="Microsoft YaHei" w:hAnsi="Microsoft YaHei" w:eastAsia="Microsoft YaHei"/>
-                <w:b w:val="0"/>
-                <w:i w:val="0"/>
-                <w:sz w:val="20"/>
-              </w:rPr>
-              <w:t>M5</w:t>
-            </w:r>
-          </w:p>
-        </w:tc>
-        <w:tc>
-          <w:tcPr>
-            <w:tcW w:type="dxa" w:w="2268"/>
+            <w:tcW w:type="dxa" w:w="1814"/>
+          </w:tcPr>
+          <w:p>
+            <w:r/>
+            <w:r>
+              <w:rPr>
+                <w:rFonts w:ascii="Microsoft YaHei" w:hAnsi="Microsoft YaHei" w:eastAsia="Microsoft YaHei"/>
+                <w:b w:val="0"/>
+                <w:i w:val="0"/>
+                <w:sz w:val="20"/>
+              </w:rPr>
+              <w:t>M5-EXT</w:t>
+            </w:r>
+          </w:p>
+        </w:tc>
+        <w:tc>
+          <w:tcPr>
+            <w:tcW w:type="dxa" w:w="1814"/>
           </w:tcPr>
           <w:p>
             <w:r/>
@@ -9736,6 +9852,23 @@
                 <w:sz w:val="20"/>
               </w:rPr>
               <w:t>开发</w:t>
+            </w:r>
+          </w:p>
+        </w:tc>
+        <w:tc>
+          <w:tcPr>
+            <w:tcW w:type="dxa" w:w="1814"/>
+          </w:tcPr>
+          <w:p>
+            <w:r/>
+            <w:r>
+              <w:rPr>
+                <w:rFonts w:ascii="Microsoft YaHei" w:hAnsi="Microsoft YaHei" w:eastAsia="Microsoft YaHei"/>
+                <w:b w:val="0"/>
+                <w:i w:val="0"/>
+                <w:sz w:val="20"/>
+              </w:rPr>
+              <w:t>✅ 默认 50</w:t>
             </w:r>
           </w:p>
         </w:tc>
@@ -9743,7 +9876,7 @@
       <w:tr>
         <w:tc>
           <w:tcPr>
-            <w:tcW w:type="dxa" w:w="2268"/>
+            <w:tcW w:type="dxa" w:w="1814"/>
           </w:tcPr>
           <w:p>
             <w:r/>
@@ -9760,7 +9893,7 @@
         </w:tc>
         <w:tc>
           <w:tcPr>
-            <w:tcW w:type="dxa" w:w="2268"/>
+            <w:tcW w:type="dxa" w:w="1814"/>
           </w:tcPr>
           <w:p>
             <w:r/>
@@ -9777,7 +9910,7 @@
         </w:tc>
         <w:tc>
           <w:tcPr>
-            <w:tcW w:type="dxa" w:w="2268"/>
+            <w:tcW w:type="dxa" w:w="1814"/>
           </w:tcPr>
           <w:p>
             <w:r/>
@@ -9794,7 +9927,7 @@
         </w:tc>
         <w:tc>
           <w:tcPr>
-            <w:tcW w:type="dxa" w:w="2268"/>
+            <w:tcW w:type="dxa" w:w="1814"/>
           </w:tcPr>
           <w:p>
             <w:r/>
@@ -9806,6 +9939,23 @@
                 <w:sz w:val="20"/>
               </w:rPr>
               <w:t>运营</w:t>
+            </w:r>
+          </w:p>
+        </w:tc>
+        <w:tc>
+          <w:tcPr>
+            <w:tcW w:type="dxa" w:w="1814"/>
+          </w:tcPr>
+          <w:p>
+            <w:r/>
+            <w:r>
+              <w:rPr>
+                <w:rFonts w:ascii="Microsoft YaHei" w:hAnsi="Microsoft YaHei" w:eastAsia="Microsoft YaHei"/>
+                <w:b w:val="0"/>
+                <w:i w:val="0"/>
+                <w:sz w:val="20"/>
+              </w:rPr>
+              <w:t>🚫 Blocked</w:t>
             </w:r>
           </w:p>
         </w:tc>
@@ -9813,7 +9963,7 @@
       <w:tr>
         <w:tc>
           <w:tcPr>
-            <w:tcW w:type="dxa" w:w="2268"/>
+            <w:tcW w:type="dxa" w:w="1814"/>
           </w:tcPr>
           <w:p>
             <w:r/>
@@ -9830,7 +9980,7 @@
         </w:tc>
         <w:tc>
           <w:tcPr>
-            <w:tcW w:type="dxa" w:w="2268"/>
+            <w:tcW w:type="dxa" w:w="1814"/>
           </w:tcPr>
           <w:p>
             <w:r/>
@@ -9847,7 +9997,7 @@
         </w:tc>
         <w:tc>
           <w:tcPr>
-            <w:tcW w:type="dxa" w:w="2268"/>
+            <w:tcW w:type="dxa" w:w="1814"/>
           </w:tcPr>
           <w:p>
             <w:r/>
@@ -9864,7 +10014,7 @@
         </w:tc>
         <w:tc>
           <w:tcPr>
-            <w:tcW w:type="dxa" w:w="2268"/>
+            <w:tcW w:type="dxa" w:w="1814"/>
           </w:tcPr>
           <w:p>
             <w:r/>
@@ -9876,6 +10026,110 @@
                 <w:sz w:val="20"/>
               </w:rPr>
               <w:t>产品</w:t>
+            </w:r>
+          </w:p>
+        </w:tc>
+        <w:tc>
+          <w:tcPr>
+            <w:tcW w:type="dxa" w:w="1814"/>
+          </w:tcPr>
+          <w:p>
+            <w:r/>
+            <w:r>
+              <w:rPr>
+                <w:rFonts w:ascii="Microsoft YaHei" w:hAnsi="Microsoft YaHei" w:eastAsia="Microsoft YaHei"/>
+                <w:b w:val="0"/>
+                <w:i w:val="0"/>
+                <w:sz w:val="20"/>
+              </w:rPr>
+              <w:t>✅ 默认 0.65</w:t>
+            </w:r>
+          </w:p>
+        </w:tc>
+      </w:tr>
+      <w:tr>
+        <w:tc>
+          <w:tcPr>
+            <w:tcW w:type="dxa" w:w="1814"/>
+          </w:tcPr>
+          <w:p>
+            <w:r/>
+            <w:r>
+              <w:rPr>
+                <w:rFonts w:ascii="Microsoft YaHei" w:hAnsi="Microsoft YaHei" w:eastAsia="Microsoft YaHei"/>
+                <w:b w:val="0"/>
+                <w:i w:val="0"/>
+                <w:sz w:val="20"/>
+              </w:rPr>
+              <w:t>Q07</w:t>
+            </w:r>
+          </w:p>
+        </w:tc>
+        <w:tc>
+          <w:tcPr>
+            <w:tcW w:type="dxa" w:w="1814"/>
+          </w:tcPr>
+          <w:p>
+            <w:r/>
+            <w:r>
+              <w:rPr>
+                <w:rFonts w:ascii="Microsoft YaHei" w:hAnsi="Microsoft YaHei" w:eastAsia="Microsoft YaHei"/>
+                <w:b w:val="0"/>
+                <w:i w:val="0"/>
+                <w:sz w:val="20"/>
+              </w:rPr>
+              <w:t>AI 转人工：本地 vs 智齿？</w:t>
+            </w:r>
+          </w:p>
+        </w:tc>
+        <w:tc>
+          <w:tcPr>
+            <w:tcW w:type="dxa" w:w="1814"/>
+          </w:tcPr>
+          <w:p>
+            <w:r/>
+            <w:r>
+              <w:rPr>
+                <w:rFonts w:ascii="Microsoft YaHei" w:hAnsi="Microsoft YaHei" w:eastAsia="Microsoft YaHei"/>
+                <w:b w:val="0"/>
+                <w:i w:val="0"/>
+                <w:sz w:val="20"/>
+              </w:rPr>
+              <w:t>M5,M6</w:t>
+            </w:r>
+          </w:p>
+        </w:tc>
+        <w:tc>
+          <w:tcPr>
+            <w:tcW w:type="dxa" w:w="1814"/>
+          </w:tcPr>
+          <w:p>
+            <w:r/>
+            <w:r>
+              <w:rPr>
+                <w:rFonts w:ascii="Microsoft YaHei" w:hAnsi="Microsoft YaHei" w:eastAsia="Microsoft YaHei"/>
+                <w:b w:val="0"/>
+                <w:i w:val="0"/>
+                <w:sz w:val="20"/>
+              </w:rPr>
+              <w:t>产品</w:t>
+            </w:r>
+          </w:p>
+        </w:tc>
+        <w:tc>
+          <w:tcPr>
+            <w:tcW w:type="dxa" w:w="1814"/>
+          </w:tcPr>
+          <w:p>
+            <w:r/>
+            <w:r>
+              <w:rPr>
+                <w:rFonts w:ascii="Microsoft YaHei" w:hAnsi="Microsoft YaHei" w:eastAsia="Microsoft YaHei"/>
+                <w:b w:val="0"/>
+                <w:i w:val="0"/>
+                <w:sz w:val="20"/>
+              </w:rPr>
+              <w:t>⬜ 见 handoff-dual-path</w:t>
             </w:r>
           </w:p>
         </w:tc>
@@ -10549,8 +10803,455 @@
           </w:p>
         </w:tc>
       </w:tr>
+      <w:tr>
+        <w:tc>
+          <w:tcPr>
+            <w:tcW w:type="dxa" w:w="3024"/>
+          </w:tcPr>
+          <w:p>
+            <w:r/>
+            <w:r>
+              <w:rPr>
+                <w:rFonts w:ascii="Microsoft YaHei" w:hAnsi="Microsoft YaHei" w:eastAsia="Microsoft YaHei"/>
+                <w:b w:val="0"/>
+                <w:i w:val="0"/>
+                <w:sz w:val="20"/>
+              </w:rPr>
+              <w:t>V2.1</w:t>
+            </w:r>
+          </w:p>
+        </w:tc>
+        <w:tc>
+          <w:tcPr>
+            <w:tcW w:type="dxa" w:w="3024"/>
+          </w:tcPr>
+          <w:p>
+            <w:r/>
+            <w:r>
+              <w:rPr>
+                <w:rFonts w:ascii="Microsoft YaHei" w:hAnsi="Microsoft YaHei" w:eastAsia="Microsoft YaHei"/>
+                <w:b w:val="0"/>
+                <w:i w:val="0"/>
+                <w:sz w:val="20"/>
+              </w:rPr>
+              <w:t>2026-06-30</w:t>
+            </w:r>
+          </w:p>
+        </w:tc>
+        <w:tc>
+          <w:tcPr>
+            <w:tcW w:type="dxa" w:w="3024"/>
+          </w:tcPr>
+          <w:p>
+            <w:r/>
+            <w:r>
+              <w:rPr>
+                <w:rFonts w:ascii="Microsoft YaHei" w:hAnsi="Microsoft YaHei" w:eastAsia="Microsoft YaHei"/>
+                <w:b w:val="0"/>
+                <w:i w:val="0"/>
+                <w:sz w:val="20"/>
+              </w:rPr>
+              <w:t>对齐 whatsapp-bot-service：双路径转人工、L2 映射、M9 Blocked、日志字段</w:t>
+            </w:r>
+          </w:p>
+        </w:tc>
+      </w:tr>
     </w:tbl>
     <w:p/>
+    <w:p/>
+    <w:p>
+      <w:pPr>
+        <w:pStyle w:val="Heading2"/>
+      </w:pPr>
+      <w:r>
+        <w:rPr>
+          <w:rFonts w:ascii="Microsoft YaHei" w:hAnsi="Microsoft YaHei" w:eastAsia="Microsoft YaHei"/>
+          <w:b/>
+          <w:i w:val="0"/>
+          <w:sz w:val="28"/>
+        </w:rPr>
+        <w:t>12. 实现差异与测试调整（V2.1）</w:t>
+      </w:r>
+    </w:p>
+    <w:p>
+      <w:r>
+        <w:rPr>
+          <w:rFonts w:ascii="Microsoft YaHei" w:hAnsi="Microsoft YaHei" w:eastAsia="Microsoft YaHei"/>
+          <w:b w:val="0"/>
+          <w:i w:val="0"/>
+          <w:sz w:val="22"/>
+        </w:rPr>
+        <w:t xml:space="preserve">依据 </w:t>
+      </w:r>
+      <w:r>
+        <w:rPr>
+          <w:rFonts w:ascii="Consolas" w:hAnsi="Consolas" w:eastAsia="Microsoft YaHei"/>
+          <w:b w:val="0"/>
+          <w:i w:val="0"/>
+          <w:sz w:val="22"/>
+        </w:rPr>
+        <w:t>whatsapp-bot-service</w:t>
+      </w:r>
+      <w:r>
+        <w:rPr>
+          <w:rFonts w:ascii="Microsoft YaHei" w:hAnsi="Microsoft YaHei" w:eastAsia="Microsoft YaHei"/>
+          <w:b w:val="0"/>
+          <w:i w:val="0"/>
+          <w:sz w:val="22"/>
+        </w:rPr>
+        <w:t xml:space="preserve"> 源码，测试资产已同步更新：</w:t>
+      </w:r>
+    </w:p>
+    <w:tbl>
+      <w:tblPr>
+        <w:tblStyle w:val="TableGrid"/>
+        <w:tblW w:type="auto" w:w="0"/>
+        <w:jc w:val="center"/>
+        <w:tblLook w:firstColumn="1" w:firstRow="1" w:lastColumn="0" w:lastRow="0" w:noHBand="0" w:noVBand="1" w:val="04A0"/>
+      </w:tblPr>
+      <w:tblGrid>
+        <w:gridCol w:w="3024"/>
+        <w:gridCol w:w="3024"/>
+        <w:gridCol w:w="3024"/>
+      </w:tblGrid>
+      <w:tr>
+        <w:tc>
+          <w:tcPr>
+            <w:tcW w:type="dxa" w:w="3024"/>
+            <w:shd w:fill="2E5090" w:val="clear"/>
+          </w:tcPr>
+          <w:p>
+            <w:r/>
+            <w:r>
+              <w:rPr>
+                <w:rFonts w:ascii="Microsoft YaHei" w:hAnsi="Microsoft YaHei" w:eastAsia="Microsoft YaHei"/>
+                <w:b/>
+                <w:i w:val="0"/>
+                <w:color w:val="FFFFFF"/>
+                <w:sz w:val="20"/>
+              </w:rPr>
+              <w:t>差异</w:t>
+            </w:r>
+          </w:p>
+        </w:tc>
+        <w:tc>
+          <w:tcPr>
+            <w:tcW w:type="dxa" w:w="3024"/>
+            <w:shd w:fill="2E5090" w:val="clear"/>
+          </w:tcPr>
+          <w:p>
+            <w:r/>
+            <w:r>
+              <w:rPr>
+                <w:rFonts w:ascii="Microsoft YaHei" w:hAnsi="Microsoft YaHei" w:eastAsia="Microsoft YaHei"/>
+                <w:b/>
+                <w:i w:val="0"/>
+                <w:color w:val="FFFFFF"/>
+                <w:sz w:val="20"/>
+              </w:rPr>
+              <w:t>测试调整</w:t>
+            </w:r>
+          </w:p>
+        </w:tc>
+        <w:tc>
+          <w:tcPr>
+            <w:tcW w:type="dxa" w:w="3024"/>
+            <w:shd w:fill="2E5090" w:val="clear"/>
+          </w:tcPr>
+          <w:p>
+            <w:r/>
+            <w:r>
+              <w:rPr>
+                <w:rFonts w:ascii="Microsoft YaHei" w:hAnsi="Microsoft YaHei" w:eastAsia="Microsoft YaHei"/>
+                <w:b/>
+                <w:i w:val="0"/>
+                <w:color w:val="FFFFFF"/>
+                <w:sz w:val="20"/>
+              </w:rPr>
+              <w:t>文档</w:t>
+            </w:r>
+          </w:p>
+        </w:tc>
+      </w:tr>
+      <w:tr>
+        <w:tc>
+          <w:tcPr>
+            <w:tcW w:type="dxa" w:w="3024"/>
+          </w:tcPr>
+          <w:p>
+            <w:r/>
+            <w:r>
+              <w:rPr>
+                <w:rFonts w:ascii="Microsoft YaHei" w:hAnsi="Microsoft YaHei" w:eastAsia="Microsoft YaHei"/>
+                <w:b w:val="0"/>
+                <w:i w:val="0"/>
+                <w:sz w:val="20"/>
+              </w:rPr>
+              <w:t xml:space="preserve">AI 转人工默认 </w:t>
+            </w:r>
+            <w:r>
+              <w:rPr>
+                <w:rFonts w:ascii="Microsoft YaHei" w:hAnsi="Microsoft YaHei" w:eastAsia="Microsoft YaHei"/>
+                <w:b/>
+                <w:i w:val="0"/>
+                <w:sz w:val="20"/>
+              </w:rPr>
+              <w:t>本地 Web 坐席</w:t>
+            </w:r>
+            <w:r>
+              <w:rPr>
+                <w:rFonts w:ascii="Microsoft YaHei" w:hAnsi="Microsoft YaHei" w:eastAsia="Microsoft YaHei"/>
+                <w:b w:val="0"/>
+                <w:i w:val="0"/>
+                <w:sz w:val="20"/>
+              </w:rPr>
+              <w:t>，非智齿</w:t>
+            </w:r>
+          </w:p>
+        </w:tc>
+        <w:tc>
+          <w:tcPr>
+            <w:tcW w:type="dxa" w:w="3024"/>
+          </w:tcPr>
+          <w:p>
+            <w:r/>
+            <w:r>
+              <w:rPr>
+                <w:rFonts w:ascii="Microsoft YaHei" w:hAnsi="Microsoft YaHei" w:eastAsia="Microsoft YaHei"/>
+                <w:b w:val="0"/>
+                <w:i w:val="0"/>
+                <w:sz w:val="20"/>
+              </w:rPr>
+              <w:t>G2/M5 拆 LOCAL + EXT</w:t>
+            </w:r>
+          </w:p>
+        </w:tc>
+        <w:tc>
+          <w:tcPr>
+            <w:tcW w:type="dxa" w:w="3024"/>
+          </w:tcPr>
+          <w:p>
+            <w:r/>
+            <w:r>
+              <w:rPr>
+                <w:rFonts w:ascii="Consolas" w:hAnsi="Consolas" w:eastAsia="Microsoft YaHei"/>
+                <w:b w:val="0"/>
+                <w:i w:val="0"/>
+                <w:sz w:val="20"/>
+              </w:rPr>
+              <w:t>spec/handoff-dual-path.md</w:t>
+            </w:r>
+          </w:p>
+        </w:tc>
+      </w:tr>
+      <w:tr>
+        <w:tc>
+          <w:tcPr>
+            <w:tcW w:type="dxa" w:w="3024"/>
+          </w:tcPr>
+          <w:p>
+            <w:r/>
+            <w:r>
+              <w:rPr>
+                <w:rFonts w:ascii="Consolas" w:hAnsi="Consolas" w:eastAsia="Microsoft YaHei"/>
+                <w:b w:val="0"/>
+                <w:i w:val="0"/>
+                <w:sz w:val="20"/>
+              </w:rPr>
+              <w:t>ChatMessage.intent</w:t>
+            </w:r>
+            <w:r>
+              <w:rPr>
+                <w:rFonts w:ascii="Microsoft YaHei" w:hAnsi="Microsoft YaHei" w:eastAsia="Microsoft YaHei"/>
+                <w:b w:val="0"/>
+                <w:i w:val="0"/>
+                <w:sz w:val="20"/>
+              </w:rPr>
+              <w:t xml:space="preserve"> = task_type，非 PRD 七类</w:t>
+            </w:r>
+          </w:p>
+        </w:tc>
+        <w:tc>
+          <w:tcPr>
+            <w:tcW w:type="dxa" w:w="3024"/>
+          </w:tcPr>
+          <w:p>
+            <w:r/>
+            <w:r>
+              <w:rPr>
+                <w:rFonts w:ascii="Microsoft YaHei" w:hAnsi="Microsoft YaHei" w:eastAsia="Microsoft YaHei"/>
+                <w:b w:val="0"/>
+                <w:i w:val="0"/>
+                <w:sz w:val="20"/>
+              </w:rPr>
+              <w:t>L2 用映射表断言</w:t>
+            </w:r>
+          </w:p>
+        </w:tc>
+        <w:tc>
+          <w:tcPr>
+            <w:tcW w:type="dxa" w:w="3024"/>
+          </w:tcPr>
+          <w:p>
+            <w:r/>
+            <w:r>
+              <w:rPr>
+                <w:rFonts w:ascii="Consolas" w:hAnsi="Consolas" w:eastAsia="Microsoft YaHei"/>
+                <w:b w:val="0"/>
+                <w:i w:val="0"/>
+                <w:sz w:val="20"/>
+              </w:rPr>
+              <w:t>spec/intent-task-mapping.md</w:t>
+            </w:r>
+          </w:p>
+        </w:tc>
+      </w:tr>
+      <w:tr>
+        <w:tc>
+          <w:tcPr>
+            <w:tcW w:type="dxa" w:w="3024"/>
+          </w:tcPr>
+          <w:p>
+            <w:r/>
+            <w:r>
+              <w:rPr>
+                <w:rFonts w:ascii="Microsoft YaHei" w:hAnsi="Microsoft YaHei" w:eastAsia="Microsoft YaHei"/>
+                <w:b w:val="0"/>
+                <w:i w:val="0"/>
+                <w:sz w:val="20"/>
+              </w:rPr>
+              <w:t>无 knowledge_hit / 智齿客户标签字段</w:t>
+            </w:r>
+          </w:p>
+        </w:tc>
+        <w:tc>
+          <w:tcPr>
+            <w:tcW w:type="dxa" w:w="3024"/>
+          </w:tcPr>
+          <w:p>
+            <w:r/>
+            <w:r>
+              <w:rPr>
+                <w:rFonts w:ascii="Microsoft YaHei" w:hAnsi="Microsoft YaHei" w:eastAsia="Microsoft YaHei"/>
+                <w:b w:val="0"/>
+                <w:i w:val="0"/>
+                <w:sz w:val="20"/>
+              </w:rPr>
+              <w:t>M8 改查组合 API；M9 Blocked</w:t>
+            </w:r>
+          </w:p>
+        </w:tc>
+        <w:tc>
+          <w:tcPr>
+            <w:tcW w:type="dxa" w:w="3024"/>
+          </w:tcPr>
+          <w:p>
+            <w:r/>
+            <w:r>
+              <w:rPr>
+                <w:rFonts w:ascii="Consolas" w:hAnsi="Consolas" w:eastAsia="Microsoft YaHei"/>
+                <w:b w:val="0"/>
+                <w:i w:val="0"/>
+                <w:sz w:val="20"/>
+              </w:rPr>
+              <w:t>spec/log-field-mapping.md</w:t>
+            </w:r>
+          </w:p>
+        </w:tc>
+      </w:tr>
+      <w:tr>
+        <w:tc>
+          <w:tcPr>
+            <w:tcW w:type="dxa" w:w="3024"/>
+          </w:tcPr>
+          <w:p>
+            <w:r/>
+            <w:r>
+              <w:rPr>
+                <w:rFonts w:ascii="Microsoft YaHei" w:hAnsi="Microsoft YaHei" w:eastAsia="Microsoft YaHei"/>
+                <w:b w:val="0"/>
+                <w:i w:val="0"/>
+                <w:sz w:val="20"/>
+              </w:rPr>
+              <w:t>L2 无专用 chat API</w:t>
+            </w:r>
+          </w:p>
+        </w:tc>
+        <w:tc>
+          <w:tcPr>
+            <w:tcW w:type="dxa" w:w="3024"/>
+          </w:tcPr>
+          <w:p>
+            <w:r/>
+            <w:r>
+              <w:rPr>
+                <w:rFonts w:ascii="Microsoft YaHei" w:hAnsi="Microsoft YaHei" w:eastAsia="Microsoft YaHei"/>
+                <w:b w:val="0"/>
+                <w:i w:val="0"/>
+                <w:sz w:val="20"/>
+              </w:rPr>
+              <w:t>webhook + agent/session</w:t>
+            </w:r>
+          </w:p>
+        </w:tc>
+        <w:tc>
+          <w:tcPr>
+            <w:tcW w:type="dxa" w:w="3024"/>
+          </w:tcPr>
+          <w:p>
+            <w:r/>
+            <w:r>
+              <w:rPr>
+                <w:rFonts w:ascii="Consolas" w:hAnsi="Consolas" w:eastAsia="Microsoft YaHei"/>
+                <w:b w:val="0"/>
+                <w:i w:val="0"/>
+                <w:sz w:val="20"/>
+              </w:rPr>
+              <w:t>spec/api-notes.md</w:t>
+            </w:r>
+            <w:r>
+              <w:rPr>
+                <w:rFonts w:ascii="Microsoft YaHei" w:hAnsi="Microsoft YaHei" w:eastAsia="Microsoft YaHei"/>
+                <w:b w:val="0"/>
+                <w:i w:val="0"/>
+                <w:sz w:val="20"/>
+              </w:rPr>
+              <w:t>、</w:t>
+            </w:r>
+            <w:r>
+              <w:rPr>
+                <w:rFonts w:ascii="Consolas" w:hAnsi="Consolas" w:eastAsia="Microsoft YaHei"/>
+                <w:b w:val="0"/>
+                <w:i w:val="0"/>
+                <w:sz w:val="20"/>
+              </w:rPr>
+              <w:t>run_l2_eval.py</w:t>
+            </w:r>
+          </w:p>
+        </w:tc>
+      </w:tr>
+    </w:tbl>
+    <w:p/>
+    <w:p>
+      <w:r>
+        <w:rPr>
+          <w:rFonts w:ascii="Microsoft YaHei" w:hAnsi="Microsoft YaHei" w:eastAsia="Microsoft YaHei"/>
+          <w:b/>
+          <w:i w:val="0"/>
+          <w:sz w:val="22"/>
+        </w:rPr>
+        <w:t>P0 待产品裁决 Q07</w:t>
+      </w:r>
+      <w:r>
+        <w:rPr>
+          <w:rFonts w:ascii="Microsoft YaHei" w:hAnsi="Microsoft YaHei" w:eastAsia="Microsoft YaHei"/>
+          <w:b w:val="0"/>
+          <w:i w:val="0"/>
+          <w:sz w:val="22"/>
+        </w:rPr>
+        <w:t>：首版验收以本地坐席、智齿或两者为准。</w:t>
+      </w:r>
+    </w:p>
     <w:sectPr>
       <w:pgSz w:w="12240" w:h="15840"/>
       <w:pgMar w:top="1440" w:right="1584" w:bottom="1440" w:left="1584" w:header="720" w:footer="720" w:gutter="0"/>

</xml_diff>